<commit_message>
Harden MAGI routing, documents, and live health
</commit_message>
<xml_diff>
--- a/docs/guides/MAGI_驗證版完整操作手冊_2026-06-26.docx
+++ b/docs/guides/MAGI_驗證版完整操作手冊_2026-06-26.docx
@@ -1122,7 +1122,7 @@
           <w:color w:val="172033"/>
           <w:sz w:val="21"/>
         </w:rPr>
-        <w:t>這張表是手冊的功能邊界。後續章節的操作說明都對應到這些已驗證功能。</w:t>
+        <w:t>這張表改用一般使用者看得懂的功能介紹語氣，並由最新 health/intelligence snapshot 補上目前狀態提示。</w:t>
       </w:r>
     </w:p>
     <w:tbl>
@@ -1173,7 +1173,7 @@
         </w:tc>
         <w:tc>
           <w:tcPr>
-            <w:tcW w:type="dxa" w:w="2948"/>
+            <w:tcW w:type="dxa" w:w="2835"/>
             <w:vAlign w:val="center"/>
             <w:shd w:fill="0B74D1"/>
             <w:tcBorders>
@@ -1197,7 +1197,37 @@
                 <w:color w:val="FFFFFF"/>
                 <w:sz w:val="18"/>
               </w:rPr>
-              <w:t>使用者能做什麼</w:t>
+              <w:t>一般人可怎麼用</w:t>
+            </w:r>
+          </w:p>
+        </w:tc>
+        <w:tc>
+          <w:tcPr>
+            <w:tcW w:type="dxa" w:w="2154"/>
+            <w:vAlign w:val="center"/>
+            <w:shd w:fill="0B74D1"/>
+            <w:tcBorders>
+              <w:top w:val="single" w:sz="6" w:space="0" w:color="D8E2EF"/>
+              <w:left w:val="single" w:sz="6" w:space="0" w:color="D8E2EF"/>
+              <w:bottom w:val="single" w:sz="6" w:space="0" w:color="D8E2EF"/>
+              <w:right w:val="single" w:sz="6" w:space="0" w:color="D8E2EF"/>
+              <w:insideH w:val="single" w:sz="6" w:space="0" w:color="D8E2EF"/>
+              <w:insideV w:val="single" w:sz="6" w:space="0" w:color="D8E2EF"/>
+            </w:tcBorders>
+          </w:tcPr>
+          <w:p>
+            <w:pPr>
+              <w:spacing w:after="0"/>
+            </w:pPr>
+            <w:r/>
+            <w:r>
+              <w:rPr>
+                <w:rFonts w:ascii="Arial" w:hAnsi="Arial" w:eastAsia="Microsoft JhengHei"/>
+                <w:b/>
+                <w:color w:val="FFFFFF"/>
+                <w:sz w:val="18"/>
+              </w:rPr>
+              <w:t>入口或指令</w:t>
             </w:r>
           </w:p>
         </w:tc>
@@ -1227,13 +1257,13 @@
                 <w:color w:val="FFFFFF"/>
                 <w:sz w:val="18"/>
               </w:rPr>
-              <w:t>入口或指令</w:t>
+              <w:t>目前狀態</w:t>
             </w:r>
           </w:p>
         </w:tc>
         <w:tc>
           <w:tcPr>
-            <w:tcW w:type="dxa" w:w="2381"/>
+            <w:tcW w:type="dxa" w:w="1134"/>
             <w:vAlign w:val="center"/>
             <w:shd w:fill="0B74D1"/>
             <w:tcBorders>
@@ -1257,37 +1287,7 @@
                 <w:color w:val="FFFFFF"/>
                 <w:sz w:val="18"/>
               </w:rPr>
-              <w:t>驗收證據</w:t>
-            </w:r>
-          </w:p>
-        </w:tc>
-        <w:tc>
-          <w:tcPr>
-            <w:tcW w:type="dxa" w:w="680"/>
-            <w:vAlign w:val="center"/>
-            <w:shd w:fill="0B74D1"/>
-            <w:tcBorders>
-              <w:top w:val="single" w:sz="6" w:space="0" w:color="D8E2EF"/>
-              <w:left w:val="single" w:sz="6" w:space="0" w:color="D8E2EF"/>
-              <w:bottom w:val="single" w:sz="6" w:space="0" w:color="D8E2EF"/>
-              <w:right w:val="single" w:sz="6" w:space="0" w:color="D8E2EF"/>
-              <w:insideH w:val="single" w:sz="6" w:space="0" w:color="D8E2EF"/>
-              <w:insideV w:val="single" w:sz="6" w:space="0" w:color="D8E2EF"/>
-            </w:tcBorders>
-          </w:tcPr>
-          <w:p>
-            <w:pPr>
-              <w:spacing w:after="0"/>
-            </w:pPr>
-            <w:r/>
-            <w:r>
-              <w:rPr>
-                <w:rFonts w:ascii="Arial" w:hAnsi="Arial" w:eastAsia="Microsoft JhengHei"/>
-                <w:b/>
-                <w:color w:val="FFFFFF"/>
-                <w:sz w:val="18"/>
-              </w:rPr>
-              <w:t>狀態</w:t>
+              <w:t>手冊章節</w:t>
             </w:r>
           </w:p>
         </w:tc>
@@ -1319,13 +1319,13 @@
                 <w:color w:val="172033"/>
                 <w:sz w:val="17"/>
               </w:rPr>
-              <w:t>自然語言入口與工具路由</w:t>
+              <w:t>系統健康與每日啟動</w:t>
             </w:r>
           </w:p>
         </w:tc>
         <w:tc>
           <w:tcPr>
-            <w:tcW w:type="dxa" w:w="2948"/>
+            <w:tcW w:type="dxa" w:w="2835"/>
             <w:vAlign w:val="center"/>
             <w:shd w:fill="FFFFFF"/>
             <w:tcBorders>
@@ -1349,7 +1349,65 @@
                 <w:color w:val="172033"/>
                 <w:sz w:val="17"/>
               </w:rPr>
-              <w:t>區分聊天、查詢、工具調用與系統健康命令；避免把行程查詢誤判成天氣。</w:t>
+              <w:t>先看 MAGI、模型、磁碟、NAS、DB、OAuth 與背景服務是不是能安全工作。</w:t>
+            </w:r>
+          </w:p>
+        </w:tc>
+        <w:tc>
+          <w:tcPr>
+            <w:tcW w:type="dxa" w:w="2154"/>
+            <w:vAlign w:val="center"/>
+            <w:shd w:fill="FFFFFF"/>
+            <w:tcBorders>
+              <w:top w:val="single" w:sz="6" w:space="0" w:color="D8E2EF"/>
+              <w:left w:val="single" w:sz="6" w:space="0" w:color="D8E2EF"/>
+              <w:bottom w:val="single" w:sz="6" w:space="0" w:color="D8E2EF"/>
+              <w:right w:val="single" w:sz="6" w:space="0" w:color="D8E2EF"/>
+              <w:insideH w:val="single" w:sz="6" w:space="0" w:color="D8E2EF"/>
+              <w:insideV w:val="single" w:sz="6" w:space="0" w:color="D8E2EF"/>
+            </w:tcBorders>
+          </w:tcPr>
+          <w:p>
+            <w:pPr>
+              <w:spacing w:after="0"/>
+            </w:pPr>
+            <w:r/>
+            <w:r>
+              <w:rPr>
+                <w:rFonts w:ascii="Arial" w:hAnsi="Arial" w:eastAsia="Microsoft JhengHei"/>
+                <w:b w:val="0"/>
+                <w:color w:val="172033"/>
+                <w:sz w:val="17"/>
+              </w:rPr>
+              <w:t>入口：MAGI 系統狀態、/health、magi status、NERV 狀態頁。</w:t>
+            </w:r>
+          </w:p>
+          <w:p>
+            <w:pPr>
+              <w:spacing w:after="0"/>
+            </w:pPr>
+            <w:r>
+              <w:rPr>
+                <w:rFonts w:ascii="Arial" w:hAnsi="Arial" w:eastAsia="Microsoft JhengHei"/>
+                <w:b w:val="0"/>
+                <w:color w:val="172033"/>
+                <w:sz w:val="17"/>
+              </w:rPr>
+              <w:t>MAGI 系統狀態。</w:t>
+            </w:r>
+          </w:p>
+          <w:p>
+            <w:pPr>
+              <w:spacing w:after="0"/>
+            </w:pPr>
+            <w:r>
+              <w:rPr>
+                <w:rFonts w:ascii="Arial" w:hAnsi="Arial" w:eastAsia="Microsoft JhengHei"/>
+                <w:b w:val="0"/>
+                <w:color w:val="172033"/>
+                <w:sz w:val="17"/>
+              </w:rPr>
+              <w:t>跑完整 smoke62 與 commercial readiness。</w:t>
             </w:r>
           </w:p>
         </w:tc>
@@ -1379,13 +1437,13 @@
                 <w:color w:val="172033"/>
                 <w:sz w:val="17"/>
               </w:rPr>
-              <w:t>對話框、LINE/DC/TG/Webhook</w:t>
+              <w:t>最近有 LIVE 或 runtime 健康證據，可列為可用功能。</w:t>
             </w:r>
           </w:p>
         </w:tc>
         <w:tc>
           <w:tcPr>
-            <w:tcW w:type="dxa" w:w="2381"/>
+            <w:tcW w:type="dxa" w:w="1134"/>
             <w:vAlign w:val="center"/>
             <w:shd w:fill="FFFFFF"/>
             <w:tcBorders>
@@ -1409,37 +1467,7 @@
                 <w:color w:val="172033"/>
                 <w:sz w:val="17"/>
               </w:rPr>
-              <w:t>manual smoke route + no_weather_confusion</w:t>
-            </w:r>
-          </w:p>
-        </w:tc>
-        <w:tc>
-          <w:tcPr>
-            <w:tcW w:type="dxa" w:w="680"/>
-            <w:vAlign w:val="center"/>
-            <w:shd w:fill="FFFFFF"/>
-            <w:tcBorders>
-              <w:top w:val="single" w:sz="6" w:space="0" w:color="D8E2EF"/>
-              <w:left w:val="single" w:sz="6" w:space="0" w:color="D8E2EF"/>
-              <w:bottom w:val="single" w:sz="6" w:space="0" w:color="D8E2EF"/>
-              <w:right w:val="single" w:sz="6" w:space="0" w:color="D8E2EF"/>
-              <w:insideH w:val="single" w:sz="6" w:space="0" w:color="D8E2EF"/>
-              <w:insideV w:val="single" w:sz="6" w:space="0" w:color="D8E2EF"/>
-            </w:tcBorders>
-          </w:tcPr>
-          <w:p>
-            <w:pPr>
-              <w:spacing w:after="0"/>
-            </w:pPr>
-            <w:r/>
-            <w:r>
-              <w:rPr>
-                <w:rFonts w:ascii="Arial" w:hAnsi="Arial" w:eastAsia="Microsoft JhengHei"/>
-                <w:b/>
-                <w:color w:val="15803D"/>
-                <w:sz w:val="17"/>
-              </w:rPr>
-              <w:t>PASS</w:t>
+              <w:t>每日啟動與健康檢查</w:t>
             </w:r>
           </w:p>
         </w:tc>
@@ -1471,13 +1499,13 @@
                 <w:color w:val="172033"/>
                 <w:sz w:val="17"/>
               </w:rPr>
-              <w:t>@heavy / @重型高品質模式</w:t>
+              <w:t>自然語言入口與工具路由</w:t>
             </w:r>
           </w:p>
         </w:tc>
         <w:tc>
           <w:tcPr>
-            <w:tcW w:type="dxa" w:w="2948"/>
+            <w:tcW w:type="dxa" w:w="2835"/>
             <w:vAlign w:val="center"/>
             <w:shd w:fill="F8FAFC"/>
             <w:tcBorders>
@@ -1501,7 +1529,65 @@
                 <w:color w:val="172033"/>
                 <w:sz w:val="17"/>
               </w:rPr>
-              <w:t>翻譯、摘要、長 PDF 與法律文件可要求高品質讀取、對照、專有名詞保留。</w:t>
+              <w:t>用平常說法查行程、案件、文件或系統狀態；MAGI 會把需要工具的問題送到對應功能。</w:t>
+            </w:r>
+          </w:p>
+        </w:tc>
+        <w:tc>
+          <w:tcPr>
+            <w:tcW w:type="dxa" w:w="2154"/>
+            <w:vAlign w:val="center"/>
+            <w:shd w:fill="F8FAFC"/>
+            <w:tcBorders>
+              <w:top w:val="single" w:sz="6" w:space="0" w:color="D8E2EF"/>
+              <w:left w:val="single" w:sz="6" w:space="0" w:color="D8E2EF"/>
+              <w:bottom w:val="single" w:sz="6" w:space="0" w:color="D8E2EF"/>
+              <w:right w:val="single" w:sz="6" w:space="0" w:color="D8E2EF"/>
+              <w:insideH w:val="single" w:sz="6" w:space="0" w:color="D8E2EF"/>
+              <w:insideV w:val="single" w:sz="6" w:space="0" w:color="D8E2EF"/>
+            </w:tcBorders>
+          </w:tcPr>
+          <w:p>
+            <w:pPr>
+              <w:spacing w:after="0"/>
+            </w:pPr>
+            <w:r/>
+            <w:r>
+              <w:rPr>
+                <w:rFonts w:ascii="Arial" w:hAnsi="Arial" w:eastAsia="Microsoft JhengHei"/>
+                <w:b w:val="0"/>
+                <w:color w:val="172033"/>
+                <w:sz w:val="17"/>
+              </w:rPr>
+              <w:t>入口：聊天框、LINE / Discord / Telegram、@heavy / @重型。</w:t>
+            </w:r>
+          </w:p>
+          <w:p>
+            <w:pPr>
+              <w:spacing w:after="0"/>
+            </w:pPr>
+            <w:r>
+              <w:rPr>
+                <w:rFonts w:ascii="Arial" w:hAnsi="Arial" w:eastAsia="Microsoft JhengHei"/>
+                <w:b w:val="0"/>
+                <w:color w:val="172033"/>
+                <w:sz w:val="17"/>
+              </w:rPr>
+              <w:t>今天有什麼行程？</w:t>
+            </w:r>
+          </w:p>
+          <w:p>
+            <w:pPr>
+              <w:spacing w:after="0"/>
+            </w:pPr>
+            <w:r>
+              <w:rPr>
+                <w:rFonts w:ascii="Arial" w:hAnsi="Arial" w:eastAsia="Microsoft JhengHei"/>
+                <w:b w:val="0"/>
+                <w:color w:val="172033"/>
+                <w:sz w:val="17"/>
+              </w:rPr>
+              <w:t>@heavy 翻譯這份 PDF，專有名詞後保留原文。</w:t>
             </w:r>
           </w:p>
         </w:tc>
@@ -1531,13 +1617,13 @@
                 <w:color w:val="172033"/>
                 <w:sz w:val="17"/>
               </w:rPr>
-              <w:t>訊息前加 @heavy 或 @重型</w:t>
+              <w:t>最近有 LIVE 或 runtime 健康證據，可列為可用功能。</w:t>
             </w:r>
           </w:p>
         </w:tc>
         <w:tc>
           <w:tcPr>
-            <w:tcW w:type="dxa" w:w="2381"/>
+            <w:tcW w:type="dxa" w:w="1134"/>
             <w:vAlign w:val="center"/>
             <w:shd w:fill="F8FAFC"/>
             <w:tcBorders>
@@ -1561,37 +1647,7 @@
                 <w:color w:val="172033"/>
                 <w:sz w:val="17"/>
               </w:rPr>
-              <w:t>manual smoke route:@heavy 翻譯 PDF</w:t>
-            </w:r>
-          </w:p>
-        </w:tc>
-        <w:tc>
-          <w:tcPr>
-            <w:tcW w:type="dxa" w:w="680"/>
-            <w:vAlign w:val="center"/>
-            <w:shd w:fill="F8FAFC"/>
-            <w:tcBorders>
-              <w:top w:val="single" w:sz="6" w:space="0" w:color="D8E2EF"/>
-              <w:left w:val="single" w:sz="6" w:space="0" w:color="D8E2EF"/>
-              <w:bottom w:val="single" w:sz="6" w:space="0" w:color="D8E2EF"/>
-              <w:right w:val="single" w:sz="6" w:space="0" w:color="D8E2EF"/>
-              <w:insideH w:val="single" w:sz="6" w:space="0" w:color="D8E2EF"/>
-              <w:insideV w:val="single" w:sz="6" w:space="0" w:color="D8E2EF"/>
-            </w:tcBorders>
-          </w:tcPr>
-          <w:p>
-            <w:pPr>
-              <w:spacing w:after="0"/>
-            </w:pPr>
-            <w:r/>
-            <w:r>
-              <w:rPr>
-                <w:rFonts w:ascii="Arial" w:hAnsi="Arial" w:eastAsia="Microsoft JhengHei"/>
-                <w:b/>
-                <w:color w:val="15803D"/>
-                <w:sz w:val="17"/>
-              </w:rPr>
-              <w:t>PASS</w:t>
+              <w:t>對話、指令與工具調用</w:t>
             </w:r>
           </w:p>
         </w:tc>
@@ -1629,7 +1685,7 @@
         </w:tc>
         <w:tc>
           <w:tcPr>
-            <w:tcW w:type="dxa" w:w="2948"/>
+            <w:tcW w:type="dxa" w:w="2835"/>
             <w:vAlign w:val="center"/>
             <w:shd w:fill="FFFFFF"/>
             <w:tcBorders>
@@ -1653,7 +1709,65 @@
                 <w:color w:val="172033"/>
                 <w:sz w:val="17"/>
               </w:rPr>
-              <w:t>查案件狀態、打開案件資料夾、建立標準資料夾結構。</w:t>
+              <w:t>用案號、當事人或案件線索查案件，並打開標準案件資料夾與終局文件區。</w:t>
+            </w:r>
+          </w:p>
+        </w:tc>
+        <w:tc>
+          <w:tcPr>
+            <w:tcW w:type="dxa" w:w="2154"/>
+            <w:vAlign w:val="center"/>
+            <w:shd w:fill="FFFFFF"/>
+            <w:tcBorders>
+              <w:top w:val="single" w:sz="6" w:space="0" w:color="D8E2EF"/>
+              <w:left w:val="single" w:sz="6" w:space="0" w:color="D8E2EF"/>
+              <w:bottom w:val="single" w:sz="6" w:space="0" w:color="D8E2EF"/>
+              <w:right w:val="single" w:sz="6" w:space="0" w:color="D8E2EF"/>
+              <w:insideH w:val="single" w:sz="6" w:space="0" w:color="D8E2EF"/>
+              <w:insideV w:val="single" w:sz="6" w:space="0" w:color="D8E2EF"/>
+            </w:tcBorders>
+          </w:tcPr>
+          <w:p>
+            <w:pPr>
+              <w:spacing w:after="0"/>
+            </w:pPr>
+            <w:r/>
+            <w:r>
+              <w:rPr>
+                <w:rFonts w:ascii="Arial" w:hAnsi="Arial" w:eastAsia="Microsoft JhengHei"/>
+                <w:b w:val="0"/>
+                <w:color w:val="172033"/>
+                <w:sz w:val="17"/>
+              </w:rPr>
+              <w:t>入口：案件頁、自然語言案件查詢、資料夾捷徑。</w:t>
+            </w:r>
+          </w:p>
+          <w:p>
+            <w:pPr>
+              <w:spacing w:after="0"/>
+            </w:pPr>
+            <w:r>
+              <w:rPr>
+                <w:rFonts w:ascii="Arial" w:hAnsi="Arial" w:eastAsia="Microsoft JhengHei"/>
+                <w:b w:val="0"/>
+                <w:color w:val="172033"/>
+                <w:sz w:val="17"/>
+              </w:rPr>
+              <w:t>查 2026-0001 的案件狀態。</w:t>
+            </w:r>
+          </w:p>
+          <w:p>
+            <w:pPr>
+              <w:spacing w:after="0"/>
+            </w:pPr>
+            <w:r>
+              <w:rPr>
+                <w:rFonts w:ascii="Arial" w:hAnsi="Arial" w:eastAsia="Microsoft JhengHei"/>
+                <w:b w:val="0"/>
+                <w:color w:val="172033"/>
+                <w:sz w:val="17"/>
+              </w:rPr>
+              <w:t>打開 2026-0001 資料夾。</w:t>
             </w:r>
           </w:p>
         </w:tc>
@@ -1683,13 +1797,13 @@
                 <w:color w:val="172033"/>
                 <w:sz w:val="17"/>
               </w:rPr>
-              <w:t>案件頁或自然語言</w:t>
+              <w:t>最近有 LIVE 或 runtime 健康證據，可列為可用功能。</w:t>
             </w:r>
           </w:p>
         </w:tc>
         <w:tc>
           <w:tcPr>
-            <w:tcW w:type="dxa" w:w="2381"/>
+            <w:tcW w:type="dxa" w:w="1134"/>
             <w:vAlign w:val="center"/>
             <w:shd w:fill="FFFFFF"/>
             <w:tcBorders>
@@ -1713,37 +1827,7 @@
                 <w:color w:val="172033"/>
                 <w:sz w:val="17"/>
               </w:rPr>
-              <w:t>manual smoke case_query + folder query</w:t>
-            </w:r>
-          </w:p>
-        </w:tc>
-        <w:tc>
-          <w:tcPr>
-            <w:tcW w:type="dxa" w:w="680"/>
-            <w:vAlign w:val="center"/>
-            <w:shd w:fill="FFFFFF"/>
-            <w:tcBorders>
-              <w:top w:val="single" w:sz="6" w:space="0" w:color="D8E2EF"/>
-              <w:left w:val="single" w:sz="6" w:space="0" w:color="D8E2EF"/>
-              <w:bottom w:val="single" w:sz="6" w:space="0" w:color="D8E2EF"/>
-              <w:right w:val="single" w:sz="6" w:space="0" w:color="D8E2EF"/>
-              <w:insideH w:val="single" w:sz="6" w:space="0" w:color="D8E2EF"/>
-              <w:insideV w:val="single" w:sz="6" w:space="0" w:color="D8E2EF"/>
-            </w:tcBorders>
-          </w:tcPr>
-          <w:p>
-            <w:pPr>
-              <w:spacing w:after="0"/>
-            </w:pPr>
-            <w:r/>
-            <w:r>
-              <w:rPr>
-                <w:rFonts w:ascii="Arial" w:hAnsi="Arial" w:eastAsia="Microsoft JhengHei"/>
-                <w:b/>
-                <w:color w:val="15803D"/>
-                <w:sz w:val="17"/>
-              </w:rPr>
-              <w:t>PASS</w:t>
+              <w:t>案件與資料夾</w:t>
             </w:r>
           </w:p>
         </w:tc>
@@ -1775,13 +1859,13 @@
                 <w:color w:val="172033"/>
                 <w:sz w:val="17"/>
               </w:rPr>
-              <w:t>判決書或終局裁定及處分</w:t>
+              <w:t>Google Calendar 與 OSC 待辦</w:t>
             </w:r>
           </w:p>
         </w:tc>
         <w:tc>
           <w:tcPr>
-            <w:tcW w:type="dxa" w:w="2948"/>
+            <w:tcW w:type="dxa" w:w="2835"/>
             <w:vAlign w:val="center"/>
             <w:shd w:fill="F8FAFC"/>
             <w:tcBorders>
@@ -1805,7 +1889,65 @@
                 <w:color w:val="172033"/>
                 <w:sz w:val="17"/>
               </w:rPr>
-              <w:t>新建案件與既有案件使用新資料夾名稱；舊判決書資料夾相容讀取。</w:t>
+              <w:t>查今日或本週行程、看 OSC 待辦，並讓外部日曆事件保留原本標題。</w:t>
+            </w:r>
+          </w:p>
+        </w:tc>
+        <w:tc>
+          <w:tcPr>
+            <w:tcW w:type="dxa" w:w="2154"/>
+            <w:vAlign w:val="center"/>
+            <w:shd w:fill="F8FAFC"/>
+            <w:tcBorders>
+              <w:top w:val="single" w:sz="6" w:space="0" w:color="D8E2EF"/>
+              <w:left w:val="single" w:sz="6" w:space="0" w:color="D8E2EF"/>
+              <w:bottom w:val="single" w:sz="6" w:space="0" w:color="D8E2EF"/>
+              <w:right w:val="single" w:sz="6" w:space="0" w:color="D8E2EF"/>
+              <w:insideH w:val="single" w:sz="6" w:space="0" w:color="D8E2EF"/>
+              <w:insideV w:val="single" w:sz="6" w:space="0" w:color="D8E2EF"/>
+            </w:tcBorders>
+          </w:tcPr>
+          <w:p>
+            <w:pPr>
+              <w:spacing w:after="0"/>
+            </w:pPr>
+            <w:r/>
+            <w:r>
+              <w:rPr>
+                <w:rFonts w:ascii="Arial" w:hAnsi="Arial" w:eastAsia="Microsoft JhengHei"/>
+                <w:b w:val="0"/>
+                <w:color w:val="172033"/>
+                <w:sz w:val="17"/>
+              </w:rPr>
+              <w:t>入口：Calendar、OSC 待辦頁、自然語言。</w:t>
+            </w:r>
+          </w:p>
+          <w:p>
+            <w:pPr>
+              <w:spacing w:after="0"/>
+            </w:pPr>
+            <w:r>
+              <w:rPr>
+                <w:rFonts w:ascii="Arial" w:hAnsi="Arial" w:eastAsia="Microsoft JhengHei"/>
+                <w:b w:val="0"/>
+                <w:color w:val="172033"/>
+                <w:sz w:val="17"/>
+              </w:rPr>
+              <w:t>今天有什麼行程？</w:t>
+            </w:r>
+          </w:p>
+          <w:p>
+            <w:pPr>
+              <w:spacing w:after="0"/>
+            </w:pPr>
+            <w:r>
+              <w:rPr>
+                <w:rFonts w:ascii="Arial" w:hAnsi="Arial" w:eastAsia="Microsoft JhengHei"/>
+                <w:b w:val="0"/>
+                <w:color w:val="172033"/>
+                <w:sz w:val="17"/>
+              </w:rPr>
+              <w:t>列出本週 OSC 建立待辦。</w:t>
             </w:r>
           </w:p>
         </w:tc>
@@ -1835,13 +1977,13 @@
                 <w:color w:val="172033"/>
                 <w:sz w:val="17"/>
               </w:rPr>
-              <w:t>案件資料夾、結案區、法扶書類分類</w:t>
+              <w:t>最近有 LIVE 或 runtime 健康證據，可列為可用功能。</w:t>
             </w:r>
           </w:p>
         </w:tc>
         <w:tc>
           <w:tcPr>
-            <w:tcW w:type="dxa" w:w="2381"/>
+            <w:tcW w:type="dxa" w:w="1134"/>
             <w:vAlign w:val="center"/>
             <w:shd w:fill="F8FAFC"/>
             <w:tcBorders>
@@ -1865,37 +2007,7 @@
                 <w:color w:val="172033"/>
                 <w:sz w:val="17"/>
               </w:rPr>
-              <w:t>CI + production-live + LAF skill path audit</w:t>
-            </w:r>
-          </w:p>
-        </w:tc>
-        <w:tc>
-          <w:tcPr>
-            <w:tcW w:type="dxa" w:w="680"/>
-            <w:vAlign w:val="center"/>
-            <w:shd w:fill="F8FAFC"/>
-            <w:tcBorders>
-              <w:top w:val="single" w:sz="6" w:space="0" w:color="D8E2EF"/>
-              <w:left w:val="single" w:sz="6" w:space="0" w:color="D8E2EF"/>
-              <w:bottom w:val="single" w:sz="6" w:space="0" w:color="D8E2EF"/>
-              <w:right w:val="single" w:sz="6" w:space="0" w:color="D8E2EF"/>
-              <w:insideH w:val="single" w:sz="6" w:space="0" w:color="D8E2EF"/>
-              <w:insideV w:val="single" w:sz="6" w:space="0" w:color="D8E2EF"/>
-            </w:tcBorders>
-          </w:tcPr>
-          <w:p>
-            <w:pPr>
-              <w:spacing w:after="0"/>
-            </w:pPr>
-            <w:r/>
-            <w:r>
-              <w:rPr>
-                <w:rFonts w:ascii="Arial" w:hAnsi="Arial" w:eastAsia="Microsoft JhengHei"/>
-                <w:b/>
-                <w:color w:val="15803D"/>
-                <w:sz w:val="17"/>
-              </w:rPr>
-              <w:t>PASS</w:t>
+              <w:t>Calendar 與 OSC 待辦</w:t>
             </w:r>
           </w:p>
         </w:tc>
@@ -1927,13 +2039,13 @@
                 <w:color w:val="172033"/>
                 <w:sz w:val="17"/>
               </w:rPr>
-              <w:t>Google Calendar 與 OSC 待辦</w:t>
+              <w:t>法扶業務模組</w:t>
             </w:r>
           </w:p>
         </w:tc>
         <w:tc>
           <w:tcPr>
-            <w:tcW w:type="dxa" w:w="2948"/>
+            <w:tcW w:type="dxa" w:w="2835"/>
             <w:vAlign w:val="center"/>
             <w:shd w:fill="FFFFFF"/>
             <w:tcBorders>
@@ -1957,7 +2069,65 @@
                 <w:color w:val="172033"/>
                 <w:sz w:val="17"/>
               </w:rPr>
-              <w:t>查今日行程、列本週 OSC 建立待辦、同步外部日曆，保留手動事件標題。</w:t>
+              <w:t>處理法扶派案、狀態查詢、開辦/報結資料檢查、待補資料文字與文件分類。</w:t>
+            </w:r>
+          </w:p>
+        </w:tc>
+        <w:tc>
+          <w:tcPr>
+            <w:tcW w:type="dxa" w:w="2154"/>
+            <w:vAlign w:val="center"/>
+            <w:shd w:fill="FFFFFF"/>
+            <w:tcBorders>
+              <w:top w:val="single" w:sz="6" w:space="0" w:color="D8E2EF"/>
+              <w:left w:val="single" w:sz="6" w:space="0" w:color="D8E2EF"/>
+              <w:bottom w:val="single" w:sz="6" w:space="0" w:color="D8E2EF"/>
+              <w:right w:val="single" w:sz="6" w:space="0" w:color="D8E2EF"/>
+              <w:insideH w:val="single" w:sz="6" w:space="0" w:color="D8E2EF"/>
+              <w:insideV w:val="single" w:sz="6" w:space="0" w:color="D8E2EF"/>
+            </w:tcBorders>
+          </w:tcPr>
+          <w:p>
+            <w:pPr>
+              <w:spacing w:after="0"/>
+            </w:pPr>
+            <w:r/>
+            <w:r>
+              <w:rPr>
+                <w:rFonts w:ascii="Arial" w:hAnsi="Arial" w:eastAsia="Microsoft JhengHei"/>
+                <w:b w:val="0"/>
+                <w:color w:val="172033"/>
+                <w:sz w:val="17"/>
+              </w:rPr>
+              <w:t>入口：法扶頁、自然語言、夜間巡檢。</w:t>
+            </w:r>
+          </w:p>
+          <w:p>
+            <w:pPr>
+              <w:spacing w:after="0"/>
+            </w:pPr>
+            <w:r>
+              <w:rPr>
+                <w:rFonts w:ascii="Arial" w:hAnsi="Arial" w:eastAsia="Microsoft JhengHei"/>
+                <w:b w:val="0"/>
+                <w:color w:val="172033"/>
+                <w:sz w:val="17"/>
+              </w:rPr>
+              <w:t>查 1150421-W-004 法扶狀態。</w:t>
+            </w:r>
+          </w:p>
+          <w:p>
+            <w:pPr>
+              <w:spacing w:after="0"/>
+            </w:pPr>
+            <w:r>
+              <w:rPr>
+                <w:rFonts w:ascii="Arial" w:hAnsi="Arial" w:eastAsia="Microsoft JhengHei"/>
+                <w:b w:val="0"/>
+                <w:color w:val="172033"/>
+                <w:sz w:val="17"/>
+              </w:rPr>
+              <w:t>產生這件消債案件的待補資料文字。</w:t>
             </w:r>
           </w:p>
         </w:tc>
@@ -1987,13 +2157,13 @@
                 <w:color w:val="172033"/>
                 <w:sz w:val="17"/>
               </w:rPr>
-              <w:t>Calendar / 待辦頁 / 自然語言</w:t>
+              <w:t>最近有 LIVE 或 runtime 健康證據，可列為可用功能。</w:t>
             </w:r>
           </w:p>
         </w:tc>
         <w:tc>
           <w:tcPr>
-            <w:tcW w:type="dxa" w:w="2381"/>
+            <w:tcW w:type="dxa" w:w="1134"/>
             <w:vAlign w:val="center"/>
             <w:shd w:fill="FFFFFF"/>
             <w:tcBorders>
@@ -2017,37 +2187,7 @@
                 <w:color w:val="172033"/>
                 <w:sz w:val="17"/>
               </w:rPr>
-              <w:t>manual smoke calendar_query/todo_query + tests/test_osc_events_refresh.py</w:t>
-            </w:r>
-          </w:p>
-        </w:tc>
-        <w:tc>
-          <w:tcPr>
-            <w:tcW w:type="dxa" w:w="680"/>
-            <w:vAlign w:val="center"/>
-            <w:shd w:fill="FFFFFF"/>
-            <w:tcBorders>
-              <w:top w:val="single" w:sz="6" w:space="0" w:color="D8E2EF"/>
-              <w:left w:val="single" w:sz="6" w:space="0" w:color="D8E2EF"/>
-              <w:bottom w:val="single" w:sz="6" w:space="0" w:color="D8E2EF"/>
-              <w:right w:val="single" w:sz="6" w:space="0" w:color="D8E2EF"/>
-              <w:insideH w:val="single" w:sz="6" w:space="0" w:color="D8E2EF"/>
-              <w:insideV w:val="single" w:sz="6" w:space="0" w:color="D8E2EF"/>
-            </w:tcBorders>
-          </w:tcPr>
-          <w:p>
-            <w:pPr>
-              <w:spacing w:after="0"/>
-            </w:pPr>
-            <w:r/>
-            <w:r>
-              <w:rPr>
-                <w:rFonts w:ascii="Arial" w:hAnsi="Arial" w:eastAsia="Microsoft JhengHei"/>
-                <w:b/>
-                <w:color w:val="15803D"/>
-                <w:sz w:val="17"/>
-              </w:rPr>
-              <w:t>PASS</w:t>
+              <w:t>法扶業務</w:t>
             </w:r>
           </w:p>
         </w:tc>
@@ -2079,13 +2219,13 @@
                 <w:color w:val="172033"/>
                 <w:sz w:val="17"/>
               </w:rPr>
-              <w:t>法扶業務模組</w:t>
+              <w:t>閱卷業務模組</w:t>
             </w:r>
           </w:p>
         </w:tc>
         <w:tc>
           <w:tcPr>
-            <w:tcW w:type="dxa" w:w="2948"/>
+            <w:tcW w:type="dxa" w:w="2835"/>
             <w:vAlign w:val="center"/>
             <w:shd w:fill="F8FAFC"/>
             <w:tcBorders>
@@ -2109,7 +2249,65 @@
                 <w:color w:val="172033"/>
                 <w:sz w:val="17"/>
               </w:rPr>
-              <w:t>查法扶狀態、派案/開辦/報結資料檢查、待補資料文字產生。</w:t>
+              <w:t>分辨待繳費、可下載、到院閱卷與已略過，避免把繳費單當成閱卷成果。</w:t>
+            </w:r>
+          </w:p>
+        </w:tc>
+        <w:tc>
+          <w:tcPr>
+            <w:tcW w:type="dxa" w:w="2154"/>
+            <w:vAlign w:val="center"/>
+            <w:shd w:fill="F8FAFC"/>
+            <w:tcBorders>
+              <w:top w:val="single" w:sz="6" w:space="0" w:color="D8E2EF"/>
+              <w:left w:val="single" w:sz="6" w:space="0" w:color="D8E2EF"/>
+              <w:bottom w:val="single" w:sz="6" w:space="0" w:color="D8E2EF"/>
+              <w:right w:val="single" w:sz="6" w:space="0" w:color="D8E2EF"/>
+              <w:insideH w:val="single" w:sz="6" w:space="0" w:color="D8E2EF"/>
+              <w:insideV w:val="single" w:sz="6" w:space="0" w:color="D8E2EF"/>
+            </w:tcBorders>
+          </w:tcPr>
+          <w:p>
+            <w:pPr>
+              <w:spacing w:after="0"/>
+            </w:pPr>
+            <w:r/>
+            <w:r>
+              <w:rPr>
+                <w:rFonts w:ascii="Arial" w:hAnsi="Arial" w:eastAsia="Microsoft JhengHei"/>
+                <w:b w:val="0"/>
+                <w:color w:val="172033"/>
+                <w:sz w:val="17"/>
+              </w:rPr>
+              <w:t>入口：閱卷頁、自然語言、夜間巡檢。</w:t>
+            </w:r>
+          </w:p>
+          <w:p>
+            <w:pPr>
+              <w:spacing w:after="0"/>
+            </w:pPr>
+            <w:r>
+              <w:rPr>
+                <w:rFonts w:ascii="Arial" w:hAnsi="Arial" w:eastAsia="Microsoft JhengHei"/>
+                <w:b w:val="0"/>
+                <w:color w:val="172033"/>
+                <w:sz w:val="17"/>
+              </w:rPr>
+              <w:t>檢查這件是否有新閱卷資料。</w:t>
+            </w:r>
+          </w:p>
+          <w:p>
+            <w:pPr>
+              <w:spacing w:after="0"/>
+            </w:pPr>
+            <w:r>
+              <w:rPr>
+                <w:rFonts w:ascii="Arial" w:hAnsi="Arial" w:eastAsia="Microsoft JhengHei"/>
+                <w:b w:val="0"/>
+                <w:color w:val="172033"/>
+                <w:sz w:val="17"/>
+              </w:rPr>
+              <w:t>列出待繳費閱卷。</w:t>
             </w:r>
           </w:p>
         </w:tc>
@@ -2139,13 +2337,13 @@
                 <w:color w:val="172033"/>
                 <w:sz w:val="17"/>
               </w:rPr>
-              <w:t>法扶頁或自然語言</w:t>
+              <w:t>最近有 LIVE 或 runtime 健康證據，可列為可用功能。</w:t>
             </w:r>
           </w:p>
         </w:tc>
         <w:tc>
           <w:tcPr>
-            <w:tcW w:type="dxa" w:w="2381"/>
+            <w:tcW w:type="dxa" w:w="1134"/>
             <w:vAlign w:val="center"/>
             <w:shd w:fill="F8FAFC"/>
             <w:tcBorders>
@@ -2169,37 +2367,7 @@
                 <w:color w:val="172033"/>
                 <w:sz w:val="17"/>
               </w:rPr>
-              <w:t>laf_portal_live + laf_self_test</w:t>
-            </w:r>
-          </w:p>
-        </w:tc>
-        <w:tc>
-          <w:tcPr>
-            <w:tcW w:type="dxa" w:w="680"/>
-            <w:vAlign w:val="center"/>
-            <w:shd w:fill="F8FAFC"/>
-            <w:tcBorders>
-              <w:top w:val="single" w:sz="6" w:space="0" w:color="D8E2EF"/>
-              <w:left w:val="single" w:sz="6" w:space="0" w:color="D8E2EF"/>
-              <w:bottom w:val="single" w:sz="6" w:space="0" w:color="D8E2EF"/>
-              <w:right w:val="single" w:sz="6" w:space="0" w:color="D8E2EF"/>
-              <w:insideH w:val="single" w:sz="6" w:space="0" w:color="D8E2EF"/>
-              <w:insideV w:val="single" w:sz="6" w:space="0" w:color="D8E2EF"/>
-            </w:tcBorders>
-          </w:tcPr>
-          <w:p>
-            <w:pPr>
-              <w:spacing w:after="0"/>
-            </w:pPr>
-            <w:r/>
-            <w:r>
-              <w:rPr>
-                <w:rFonts w:ascii="Arial" w:hAnsi="Arial" w:eastAsia="Microsoft JhengHei"/>
-                <w:b/>
-                <w:color w:val="15803D"/>
-                <w:sz w:val="17"/>
-              </w:rPr>
-              <w:t>PASS</w:t>
+              <w:t>閱卷業務</w:t>
             </w:r>
           </w:p>
         </w:tc>
@@ -2231,13 +2399,13 @@
                 <w:color w:val="172033"/>
                 <w:sz w:val="17"/>
               </w:rPr>
-              <w:t>閱卷業務模組</w:t>
+              <w:t>筆錄業務模組</w:t>
             </w:r>
           </w:p>
         </w:tc>
         <w:tc>
           <w:tcPr>
-            <w:tcW w:type="dxa" w:w="2948"/>
+            <w:tcW w:type="dxa" w:w="2835"/>
             <w:vAlign w:val="center"/>
             <w:shd w:fill="FFFFFF"/>
             <w:tcBorders>
@@ -2261,7 +2429,65 @@
                 <w:color w:val="172033"/>
                 <w:sz w:val="17"/>
               </w:rPr>
-              <w:t>檢查可下載閱卷、區分待繳費與可下載、避免把繳費單當成閱卷成果。</w:t>
+              <w:t>確認 SSO、入口頁與 DB 探測後下載新筆錄；登入失敗時停止後續歸檔。</w:t>
+            </w:r>
+          </w:p>
+        </w:tc>
+        <w:tc>
+          <w:tcPr>
+            <w:tcW w:type="dxa" w:w="2154"/>
+            <w:vAlign w:val="center"/>
+            <w:shd w:fill="FFFFFF"/>
+            <w:tcBorders>
+              <w:top w:val="single" w:sz="6" w:space="0" w:color="D8E2EF"/>
+              <w:left w:val="single" w:sz="6" w:space="0" w:color="D8E2EF"/>
+              <w:bottom w:val="single" w:sz="6" w:space="0" w:color="D8E2EF"/>
+              <w:right w:val="single" w:sz="6" w:space="0" w:color="D8E2EF"/>
+              <w:insideH w:val="single" w:sz="6" w:space="0" w:color="D8E2EF"/>
+              <w:insideV w:val="single" w:sz="6" w:space="0" w:color="D8E2EF"/>
+            </w:tcBorders>
+          </w:tcPr>
+          <w:p>
+            <w:pPr>
+              <w:spacing w:after="0"/>
+            </w:pPr>
+            <w:r/>
+            <w:r>
+              <w:rPr>
+                <w:rFonts w:ascii="Arial" w:hAnsi="Arial" w:eastAsia="Microsoft JhengHei"/>
+                <w:b w:val="0"/>
+                <w:color w:val="172033"/>
+                <w:sz w:val="17"/>
+              </w:rPr>
+              <w:t>入口：筆錄頁、自然語言、夜間巡檢。</w:t>
+            </w:r>
+          </w:p>
+          <w:p>
+            <w:pPr>
+              <w:spacing w:after="0"/>
+            </w:pPr>
+            <w:r>
+              <w:rPr>
+                <w:rFonts w:ascii="Arial" w:hAnsi="Arial" w:eastAsia="Microsoft JhengHei"/>
+                <w:b w:val="0"/>
+                <w:color w:val="172033"/>
+                <w:sz w:val="17"/>
+              </w:rPr>
+              <w:t>下載這件的新筆錄。</w:t>
+            </w:r>
+          </w:p>
+          <w:p>
+            <w:pPr>
+              <w:spacing w:after="0"/>
+            </w:pPr>
+            <w:r>
+              <w:rPr>
+                <w:rFonts w:ascii="Arial" w:hAnsi="Arial" w:eastAsia="Microsoft JhengHei"/>
+                <w:b w:val="0"/>
+                <w:color w:val="172033"/>
+                <w:sz w:val="17"/>
+              </w:rPr>
+              <w:t>檢查筆錄同步狀態。</w:t>
             </w:r>
           </w:p>
         </w:tc>
@@ -2291,13 +2517,13 @@
                 <w:color w:val="172033"/>
                 <w:sz w:val="17"/>
               </w:rPr>
-              <w:t>閱卷頁或自然語言</w:t>
+              <w:t>最近有 LIVE 或 runtime 健康證據，可列為可用功能。</w:t>
             </w:r>
           </w:p>
         </w:tc>
         <w:tc>
           <w:tcPr>
-            <w:tcW w:type="dxa" w:w="2381"/>
+            <w:tcW w:type="dxa" w:w="1134"/>
             <w:vAlign w:val="center"/>
             <w:shd w:fill="FFFFFF"/>
             <w:tcBorders>
@@ -2321,37 +2547,7 @@
                 <w:color w:val="172033"/>
                 <w:sz w:val="17"/>
               </w:rPr>
-              <w:t>file_review_self_test + downloadable_probe</w:t>
-            </w:r>
-          </w:p>
-        </w:tc>
-        <w:tc>
-          <w:tcPr>
-            <w:tcW w:type="dxa" w:w="680"/>
-            <w:vAlign w:val="center"/>
-            <w:shd w:fill="FFFFFF"/>
-            <w:tcBorders>
-              <w:top w:val="single" w:sz="6" w:space="0" w:color="D8E2EF"/>
-              <w:left w:val="single" w:sz="6" w:space="0" w:color="D8E2EF"/>
-              <w:bottom w:val="single" w:sz="6" w:space="0" w:color="D8E2EF"/>
-              <w:right w:val="single" w:sz="6" w:space="0" w:color="D8E2EF"/>
-              <w:insideH w:val="single" w:sz="6" w:space="0" w:color="D8E2EF"/>
-              <w:insideV w:val="single" w:sz="6" w:space="0" w:color="D8E2EF"/>
-            </w:tcBorders>
-          </w:tcPr>
-          <w:p>
-            <w:pPr>
-              <w:spacing w:after="0"/>
-            </w:pPr>
-            <w:r/>
-            <w:r>
-              <w:rPr>
-                <w:rFonts w:ascii="Arial" w:hAnsi="Arial" w:eastAsia="Microsoft JhengHei"/>
-                <w:b/>
-                <w:color w:val="15803D"/>
-                <w:sz w:val="17"/>
-              </w:rPr>
-              <w:t>PASS</w:t>
+              <w:t>筆錄業務</w:t>
             </w:r>
           </w:p>
         </w:tc>
@@ -2383,13 +2579,13 @@
                 <w:color w:val="172033"/>
                 <w:sz w:val="17"/>
               </w:rPr>
-              <w:t>筆錄業務模組</w:t>
+              <w:t>PDF 判讀、OCR 與歸檔命名</w:t>
             </w:r>
           </w:p>
         </w:tc>
         <w:tc>
           <w:tcPr>
-            <w:tcW w:type="dxa" w:w="2948"/>
+            <w:tcW w:type="dxa" w:w="2835"/>
             <w:vAlign w:val="center"/>
             <w:shd w:fill="F8FAFC"/>
             <w:tcBorders>
@@ -2413,7 +2609,65 @@
                 <w:color w:val="172033"/>
                 <w:sz w:val="17"/>
               </w:rPr>
-              <w:t>查筆錄登入狀態、下載新筆錄、DB 探測與失敗告警。</w:t>
+              <w:t>掃描或可讀 PDF 會先抽文字，再依文件種類、日期、法院與資料夾範本產出可歸檔檔名。</w:t>
+            </w:r>
+          </w:p>
+        </w:tc>
+        <w:tc>
+          <w:tcPr>
+            <w:tcW w:type="dxa" w:w="2154"/>
+            <w:vAlign w:val="center"/>
+            <w:shd w:fill="F8FAFC"/>
+            <w:tcBorders>
+              <w:top w:val="single" w:sz="6" w:space="0" w:color="D8E2EF"/>
+              <w:left w:val="single" w:sz="6" w:space="0" w:color="D8E2EF"/>
+              <w:bottom w:val="single" w:sz="6" w:space="0" w:color="D8E2EF"/>
+              <w:right w:val="single" w:sz="6" w:space="0" w:color="D8E2EF"/>
+              <w:insideH w:val="single" w:sz="6" w:space="0" w:color="D8E2EF"/>
+              <w:insideV w:val="single" w:sz="6" w:space="0" w:color="D8E2EF"/>
+            </w:tcBorders>
+          </w:tcPr>
+          <w:p>
+            <w:pPr>
+              <w:spacing w:after="0"/>
+            </w:pPr>
+            <w:r/>
+            <w:r>
+              <w:rPr>
+                <w:rFonts w:ascii="Arial" w:hAnsi="Arial" w:eastAsia="Microsoft JhengHei"/>
+                <w:b w:val="0"/>
+                <w:color w:val="172033"/>
+                <w:sz w:val="17"/>
+              </w:rPr>
+              <w:t>入口：檔案頁、PDF 工具、@heavy。</w:t>
+            </w:r>
+          </w:p>
+          <w:p>
+            <w:pPr>
+              <w:spacing w:after="0"/>
+            </w:pPr>
+            <w:r>
+              <w:rPr>
+                <w:rFonts w:ascii="Arial" w:hAnsi="Arial" w:eastAsia="Microsoft JhengHei"/>
+                <w:b w:val="0"/>
+                <w:color w:val="172033"/>
+                <w:sz w:val="17"/>
+              </w:rPr>
+              <w:t>從這份法院通知建立待辦。</w:t>
+            </w:r>
+          </w:p>
+          <w:p>
+            <w:pPr>
+              <w:spacing w:after="0"/>
+            </w:pPr>
+            <w:r>
+              <w:rPr>
+                <w:rFonts w:ascii="Arial" w:hAnsi="Arial" w:eastAsia="Microsoft JhengHei"/>
+                <w:b w:val="0"/>
+                <w:color w:val="172033"/>
+                <w:sz w:val="17"/>
+              </w:rPr>
+              <w:t>幫這批 PDF 依資料夾範本命名。</w:t>
             </w:r>
           </w:p>
         </w:tc>
@@ -2443,13 +2697,13 @@
                 <w:color w:val="172033"/>
                 <w:sz w:val="17"/>
               </w:rPr>
-              <w:t>筆錄頁或自然語言</w:t>
+              <w:t>最近有 LIVE 或 runtime 健康證據，可列為可用功能。</w:t>
             </w:r>
           </w:p>
         </w:tc>
         <w:tc>
           <w:tcPr>
-            <w:tcW w:type="dxa" w:w="2381"/>
+            <w:tcW w:type="dxa" w:w="1134"/>
             <w:vAlign w:val="center"/>
             <w:shd w:fill="F8FAFC"/>
             <w:tcBorders>
@@ -2473,37 +2727,7 @@
                 <w:color w:val="172033"/>
                 <w:sz w:val="17"/>
               </w:rPr>
-              <w:t>transcript_self_test + transcript_db_probe</w:t>
-            </w:r>
-          </w:p>
-        </w:tc>
-        <w:tc>
-          <w:tcPr>
-            <w:tcW w:type="dxa" w:w="680"/>
-            <w:vAlign w:val="center"/>
-            <w:shd w:fill="F8FAFC"/>
-            <w:tcBorders>
-              <w:top w:val="single" w:sz="6" w:space="0" w:color="D8E2EF"/>
-              <w:left w:val="single" w:sz="6" w:space="0" w:color="D8E2EF"/>
-              <w:bottom w:val="single" w:sz="6" w:space="0" w:color="D8E2EF"/>
-              <w:right w:val="single" w:sz="6" w:space="0" w:color="D8E2EF"/>
-              <w:insideH w:val="single" w:sz="6" w:space="0" w:color="D8E2EF"/>
-              <w:insideV w:val="single" w:sz="6" w:space="0" w:color="D8E2EF"/>
-            </w:tcBorders>
-          </w:tcPr>
-          <w:p>
-            <w:pPr>
-              <w:spacing w:after="0"/>
-            </w:pPr>
-            <w:r/>
-            <w:r>
-              <w:rPr>
-                <w:rFonts w:ascii="Arial" w:hAnsi="Arial" w:eastAsia="Microsoft JhengHei"/>
-                <w:b/>
-                <w:color w:val="15803D"/>
-                <w:sz w:val="17"/>
-              </w:rPr>
-              <w:t>PASS</w:t>
+              <w:t>PDF、OCR、命名與書籤</w:t>
             </w:r>
           </w:p>
         </w:tc>
@@ -2535,13 +2759,13 @@
                 <w:color w:val="172033"/>
                 <w:sz w:val="17"/>
               </w:rPr>
-              <w:t>PDF 判讀與歸檔命名</w:t>
+              <w:t>PDF 書籤</w:t>
             </w:r>
           </w:p>
         </w:tc>
         <w:tc>
           <w:tcPr>
-            <w:tcW w:type="dxa" w:w="2948"/>
+            <w:tcW w:type="dxa" w:w="2835"/>
             <w:vAlign w:val="center"/>
             <w:shd w:fill="FFFFFF"/>
             <w:tcBorders>
@@ -2565,7 +2789,51 @@
                 <w:color w:val="172033"/>
                 <w:sz w:val="17"/>
               </w:rPr>
-              <w:t>依資料夾範本訓練命名、OCR 後判讀、輸出可歸檔檔名。</w:t>
+              <w:t>長卷宗可依文件邊界、日期與文件類型建立書籤；單一文件也會保留 page-1 書籤。</w:t>
+            </w:r>
+          </w:p>
+        </w:tc>
+        <w:tc>
+          <w:tcPr>
+            <w:tcW w:type="dxa" w:w="2154"/>
+            <w:vAlign w:val="center"/>
+            <w:shd w:fill="FFFFFF"/>
+            <w:tcBorders>
+              <w:top w:val="single" w:sz="6" w:space="0" w:color="D8E2EF"/>
+              <w:left w:val="single" w:sz="6" w:space="0" w:color="D8E2EF"/>
+              <w:bottom w:val="single" w:sz="6" w:space="0" w:color="D8E2EF"/>
+              <w:right w:val="single" w:sz="6" w:space="0" w:color="D8E2EF"/>
+              <w:insideH w:val="single" w:sz="6" w:space="0" w:color="D8E2EF"/>
+              <w:insideV w:val="single" w:sz="6" w:space="0" w:color="D8E2EF"/>
+            </w:tcBorders>
+          </w:tcPr>
+          <w:p>
+            <w:pPr>
+              <w:spacing w:after="0"/>
+            </w:pPr>
+            <w:r/>
+            <w:r>
+              <w:rPr>
+                <w:rFonts w:ascii="Arial" w:hAnsi="Arial" w:eastAsia="Microsoft JhengHei"/>
+                <w:b w:val="0"/>
+                <w:color w:val="172033"/>
+                <w:sz w:val="17"/>
+              </w:rPr>
+              <w:t>入口：PDF 工具、批次腳本、@heavy。</w:t>
+            </w:r>
+          </w:p>
+          <w:p>
+            <w:pPr>
+              <w:spacing w:after="0"/>
+            </w:pPr>
+            <w:r>
+              <w:rPr>
+                <w:rFonts w:ascii="Arial" w:hAnsi="Arial" w:eastAsia="Microsoft JhengHei"/>
+                <w:b w:val="0"/>
+                <w:color w:val="172033"/>
+                <w:sz w:val="17"/>
+              </w:rPr>
+              <w:t>@heavy 請摘要這份卷宗並建立書籤。</w:t>
             </w:r>
           </w:p>
         </w:tc>
@@ -2595,13 +2863,13 @@
                 <w:color w:val="172033"/>
                 <w:sz w:val="17"/>
               </w:rPr>
-              <w:t>檔案頁、PDF 工具、@heavy</w:t>
+              <w:t>最近有 LIVE 或 runtime 健康證據，可列為可用功能。</w:t>
             </w:r>
           </w:p>
         </w:tc>
         <w:tc>
           <w:tcPr>
-            <w:tcW w:type="dxa" w:w="2381"/>
+            <w:tcW w:type="dxa" w:w="1134"/>
             <w:vAlign w:val="center"/>
             <w:shd w:fill="FFFFFF"/>
             <w:tcBorders>
@@ -2625,37 +2893,7 @@
                 <w:color w:val="172033"/>
                 <w:sz w:val="17"/>
               </w:rPr>
-              <w:t>manual smoke document_processing + production smoke62</w:t>
-            </w:r>
-          </w:p>
-        </w:tc>
-        <w:tc>
-          <w:tcPr>
-            <w:tcW w:type="dxa" w:w="680"/>
-            <w:vAlign w:val="center"/>
-            <w:shd w:fill="FFFFFF"/>
-            <w:tcBorders>
-              <w:top w:val="single" w:sz="6" w:space="0" w:color="D8E2EF"/>
-              <w:left w:val="single" w:sz="6" w:space="0" w:color="D8E2EF"/>
-              <w:bottom w:val="single" w:sz="6" w:space="0" w:color="D8E2EF"/>
-              <w:right w:val="single" w:sz="6" w:space="0" w:color="D8E2EF"/>
-              <w:insideH w:val="single" w:sz="6" w:space="0" w:color="D8E2EF"/>
-              <w:insideV w:val="single" w:sz="6" w:space="0" w:color="D8E2EF"/>
-            </w:tcBorders>
-          </w:tcPr>
-          <w:p>
-            <w:pPr>
-              <w:spacing w:after="0"/>
-            </w:pPr>
-            <w:r/>
-            <w:r>
-              <w:rPr>
-                <w:rFonts w:ascii="Arial" w:hAnsi="Arial" w:eastAsia="Microsoft JhengHei"/>
-                <w:b/>
-                <w:color w:val="15803D"/>
-                <w:sz w:val="17"/>
-              </w:rPr>
-              <w:t>PASS</w:t>
+              <w:t>PDF、OCR、命名與書籤</w:t>
             </w:r>
           </w:p>
         </w:tc>
@@ -2687,13 +2925,13 @@
                 <w:color w:val="172033"/>
                 <w:sz w:val="17"/>
               </w:rPr>
-              <w:t>PDF 書籤</w:t>
+              <w:t>司法 API、判決資料與法律研究</w:t>
             </w:r>
           </w:p>
         </w:tc>
         <w:tc>
           <w:tcPr>
-            <w:tcW w:type="dxa" w:w="2948"/>
+            <w:tcW w:type="dxa" w:w="2835"/>
             <w:vAlign w:val="center"/>
             <w:shd w:fill="F8FAFC"/>
             <w:tcBorders>
@@ -2717,7 +2955,65 @@
                 <w:color w:val="172033"/>
                 <w:sz w:val="17"/>
               </w:rPr>
-              <w:t>長卷宗快速建立書籤；單一文件補 page-1 檔名書籤；需 OCR 的文件進入 follow-up。</w:t>
+              <w:t>查判決、法條與實務見解，並標示來源；夜間管線會回報是否仍在追趕 backlog。</w:t>
+            </w:r>
+          </w:p>
+        </w:tc>
+        <w:tc>
+          <w:tcPr>
+            <w:tcW w:type="dxa" w:w="2154"/>
+            <w:vAlign w:val="center"/>
+            <w:shd w:fill="F8FAFC"/>
+            <w:tcBorders>
+              <w:top w:val="single" w:sz="6" w:space="0" w:color="D8E2EF"/>
+              <w:left w:val="single" w:sz="6" w:space="0" w:color="D8E2EF"/>
+              <w:bottom w:val="single" w:sz="6" w:space="0" w:color="D8E2EF"/>
+              <w:right w:val="single" w:sz="6" w:space="0" w:color="D8E2EF"/>
+              <w:insideH w:val="single" w:sz="6" w:space="0" w:color="D8E2EF"/>
+              <w:insideV w:val="single" w:sz="6" w:space="0" w:color="D8E2EF"/>
+            </w:tcBorders>
+          </w:tcPr>
+          <w:p>
+            <w:pPr>
+              <w:spacing w:after="0"/>
+            </w:pPr>
+            <w:r/>
+            <w:r>
+              <w:rPr>
+                <w:rFonts w:ascii="Arial" w:hAnsi="Arial" w:eastAsia="Microsoft JhengHei"/>
+                <w:b w:val="0"/>
+                <w:color w:val="172033"/>
+                <w:sz w:val="17"/>
+              </w:rPr>
+              <w:t>入口：法律研究、夜間作業、自然語言。</w:t>
+            </w:r>
+          </w:p>
+          <w:p>
+            <w:pPr>
+              <w:spacing w:after="0"/>
+            </w:pPr>
+            <w:r>
+              <w:rPr>
+                <w:rFonts w:ascii="Arial" w:hAnsi="Arial" w:eastAsia="Microsoft JhengHei"/>
+                <w:b w:val="0"/>
+                <w:color w:val="172033"/>
+                <w:sz w:val="17"/>
+              </w:rPr>
+              <w:t>查這個爭點的實務見解。</w:t>
+            </w:r>
+          </w:p>
+          <w:p>
+            <w:pPr>
+              <w:spacing w:after="0"/>
+            </w:pPr>
+            <w:r>
+              <w:rPr>
+                <w:rFonts w:ascii="Arial" w:hAnsi="Arial" w:eastAsia="Microsoft JhengHei"/>
+                <w:b w:val="0"/>
+                <w:color w:val="172033"/>
+                <w:sz w:val="17"/>
+              </w:rPr>
+              <w:t>列出司法 API 管線健康狀態。</w:t>
             </w:r>
           </w:p>
         </w:tc>
@@ -2747,13 +3043,13 @@
                 <w:color w:val="172033"/>
                 <w:sz w:val="17"/>
               </w:rPr>
-              <w:t>檔案頁或批次腳本</w:t>
+              <w:t>最近有 LIVE 或 runtime 健康證據，可列為可用功能。</w:t>
             </w:r>
           </w:p>
         </w:tc>
         <w:tc>
           <w:tcPr>
-            <w:tcW w:type="dxa" w:w="2381"/>
+            <w:tcW w:type="dxa" w:w="1134"/>
             <w:vAlign w:val="center"/>
             <w:shd w:fill="F8FAFC"/>
             <w:tcBorders>
@@ -2777,37 +3073,7 @@
                 <w:color w:val="172033"/>
                 <w:sz w:val="17"/>
               </w:rPr>
-              <w:t>production smoke62 + weekend_bookmark_batch guards</w:t>
-            </w:r>
-          </w:p>
-        </w:tc>
-        <w:tc>
-          <w:tcPr>
-            <w:tcW w:type="dxa" w:w="680"/>
-            <w:vAlign w:val="center"/>
-            <w:shd w:fill="F8FAFC"/>
-            <w:tcBorders>
-              <w:top w:val="single" w:sz="6" w:space="0" w:color="D8E2EF"/>
-              <w:left w:val="single" w:sz="6" w:space="0" w:color="D8E2EF"/>
-              <w:bottom w:val="single" w:sz="6" w:space="0" w:color="D8E2EF"/>
-              <w:right w:val="single" w:sz="6" w:space="0" w:color="D8E2EF"/>
-              <w:insideH w:val="single" w:sz="6" w:space="0" w:color="D8E2EF"/>
-              <w:insideV w:val="single" w:sz="6" w:space="0" w:color="D8E2EF"/>
-            </w:tcBorders>
-          </w:tcPr>
-          <w:p>
-            <w:pPr>
-              <w:spacing w:after="0"/>
-            </w:pPr>
-            <w:r/>
-            <w:r>
-              <w:rPr>
-                <w:rFonts w:ascii="Arial" w:hAnsi="Arial" w:eastAsia="Microsoft JhengHei"/>
-                <w:b/>
-                <w:color w:val="15803D"/>
-                <w:sz w:val="17"/>
-              </w:rPr>
-              <w:t>PASS</w:t>
+              <w:t>法律研究與判決資料</w:t>
             </w:r>
           </w:p>
         </w:tc>
@@ -2839,13 +3105,13 @@
                 <w:color w:val="172033"/>
                 <w:sz w:val="17"/>
               </w:rPr>
-              <w:t>司法 API 與判決資料</w:t>
+              <w:t>通知分流與去重</w:t>
             </w:r>
           </w:p>
         </w:tc>
         <w:tc>
           <w:tcPr>
-            <w:tcW w:type="dxa" w:w="2948"/>
+            <w:tcW w:type="dxa" w:w="2835"/>
             <w:vAlign w:val="center"/>
             <w:shd w:fill="FFFFFF"/>
             <w:tcBorders>
@@ -2869,7 +3135,65 @@
                 <w:color w:val="172033"/>
                 <w:sz w:val="17"/>
               </w:rPr>
-              <w:t>拉取、整理、健康檢查；backlog catching up 會被明確標示。</w:t>
+              <w:t>LINE、Discord、Telegram 按 topic 分層，避免繳費、閱卷與系統健康通知互相混雜或重複。</w:t>
+            </w:r>
+          </w:p>
+        </w:tc>
+        <w:tc>
+          <w:tcPr>
+            <w:tcW w:type="dxa" w:w="2154"/>
+            <w:vAlign w:val="center"/>
+            <w:shd w:fill="FFFFFF"/>
+            <w:tcBorders>
+              <w:top w:val="single" w:sz="6" w:space="0" w:color="D8E2EF"/>
+              <w:left w:val="single" w:sz="6" w:space="0" w:color="D8E2EF"/>
+              <w:bottom w:val="single" w:sz="6" w:space="0" w:color="D8E2EF"/>
+              <w:right w:val="single" w:sz="6" w:space="0" w:color="D8E2EF"/>
+              <w:insideH w:val="single" w:sz="6" w:space="0" w:color="D8E2EF"/>
+              <w:insideV w:val="single" w:sz="6" w:space="0" w:color="D8E2EF"/>
+            </w:tcBorders>
+          </w:tcPr>
+          <w:p>
+            <w:pPr>
+              <w:spacing w:after="0"/>
+            </w:pPr>
+            <w:r/>
+            <w:r>
+              <w:rPr>
+                <w:rFonts w:ascii="Arial" w:hAnsi="Arial" w:eastAsia="Microsoft JhengHei"/>
+                <w:b w:val="0"/>
+                <w:color w:val="172033"/>
+                <w:sz w:val="17"/>
+              </w:rPr>
+              <w:t>入口：通知設定、Webhook、Red phone。</w:t>
+            </w:r>
+          </w:p>
+          <w:p>
+            <w:pPr>
+              <w:spacing w:after="0"/>
+            </w:pPr>
+            <w:r>
+              <w:rPr>
+                <w:rFonts w:ascii="Arial" w:hAnsi="Arial" w:eastAsia="Microsoft JhengHei"/>
+                <w:b w:val="0"/>
+                <w:color w:val="172033"/>
+                <w:sz w:val="17"/>
+              </w:rPr>
+              <w:t>檢查通知分流狀態。</w:t>
+            </w:r>
+          </w:p>
+          <w:p>
+            <w:pPr>
+              <w:spacing w:after="0"/>
+            </w:pPr>
+            <w:r>
+              <w:rPr>
+                <w:rFonts w:ascii="Arial" w:hAnsi="Arial" w:eastAsia="Microsoft JhengHei"/>
+                <w:b w:val="0"/>
+                <w:color w:val="172033"/>
+                <w:sz w:val="17"/>
+              </w:rPr>
+              <w:t>測試 Telegram topic routing。</w:t>
             </w:r>
           </w:p>
         </w:tc>
@@ -2899,13 +3223,13 @@
                 <w:color w:val="172033"/>
                 <w:sz w:val="17"/>
               </w:rPr>
-              <w:t>法律研究或夜間作業</w:t>
+              <w:t>最近有 LIVE 或 runtime 健康證據，可列為可用功能。</w:t>
             </w:r>
           </w:p>
         </w:tc>
         <w:tc>
           <w:tcPr>
-            <w:tcW w:type="dxa" w:w="2381"/>
+            <w:tcW w:type="dxa" w:w="1134"/>
             <w:vAlign w:val="center"/>
             <w:shd w:fill="FFFFFF"/>
             <w:tcBorders>
@@ -2929,37 +3253,7 @@
                 <w:color w:val="172033"/>
                 <w:sz w:val="17"/>
               </w:rPr>
-              <w:t>production-live judicial_api_pipeline</w:t>
-            </w:r>
-          </w:p>
-        </w:tc>
-        <w:tc>
-          <w:tcPr>
-            <w:tcW w:type="dxa" w:w="680"/>
-            <w:vAlign w:val="center"/>
-            <w:shd w:fill="FFFFFF"/>
-            <w:tcBorders>
-              <w:top w:val="single" w:sz="6" w:space="0" w:color="D8E2EF"/>
-              <w:left w:val="single" w:sz="6" w:space="0" w:color="D8E2EF"/>
-              <w:bottom w:val="single" w:sz="6" w:space="0" w:color="D8E2EF"/>
-              <w:right w:val="single" w:sz="6" w:space="0" w:color="D8E2EF"/>
-              <w:insideH w:val="single" w:sz="6" w:space="0" w:color="D8E2EF"/>
-              <w:insideV w:val="single" w:sz="6" w:space="0" w:color="D8E2EF"/>
-            </w:tcBorders>
-          </w:tcPr>
-          <w:p>
-            <w:pPr>
-              <w:spacing w:after="0"/>
-            </w:pPr>
-            <w:r/>
-            <w:r>
-              <w:rPr>
-                <w:rFonts w:ascii="Arial" w:hAnsi="Arial" w:eastAsia="Microsoft JhengHei"/>
-                <w:b/>
-                <w:color w:val="15803D"/>
-                <w:sz w:val="17"/>
-              </w:rPr>
-              <w:t>PASS</w:t>
+              <w:t>通知與分層</w:t>
             </w:r>
           </w:p>
         </w:tc>
@@ -2991,13 +3285,13 @@
                 <w:color w:val="172033"/>
                 <w:sz w:val="17"/>
               </w:rPr>
-              <w:t>通知分流與去重</w:t>
+              <w:t>Google Drive / NAS 同步</w:t>
             </w:r>
           </w:p>
         </w:tc>
         <w:tc>
           <w:tcPr>
-            <w:tcW w:type="dxa" w:w="2948"/>
+            <w:tcW w:type="dxa" w:w="2835"/>
             <w:vAlign w:val="center"/>
             <w:shd w:fill="F8FAFC"/>
             <w:tcBorders>
@@ -3021,7 +3315,51 @@
                 <w:color w:val="172033"/>
                 <w:sz w:val="17"/>
               </w:rPr>
-              <w:t>LINE/Discord/Telegram 按 topic 分流，繳費與閱卷下載不重複推送同內容。</w:t>
+              <w:t>檢查 NAS 掛載、Drive 下載/上傳與案件檔案同步，失敗時指出是 token、路徑或 API 問題。</w:t>
+            </w:r>
+          </w:p>
+        </w:tc>
+        <w:tc>
+          <w:tcPr>
+            <w:tcW w:type="dxa" w:w="2154"/>
+            <w:vAlign w:val="center"/>
+            <w:shd w:fill="F8FAFC"/>
+            <w:tcBorders>
+              <w:top w:val="single" w:sz="6" w:space="0" w:color="D8E2EF"/>
+              <w:left w:val="single" w:sz="6" w:space="0" w:color="D8E2EF"/>
+              <w:bottom w:val="single" w:sz="6" w:space="0" w:color="D8E2EF"/>
+              <w:right w:val="single" w:sz="6" w:space="0" w:color="D8E2EF"/>
+              <w:insideH w:val="single" w:sz="6" w:space="0" w:color="D8E2EF"/>
+              <w:insideV w:val="single" w:sz="6" w:space="0" w:color="D8E2EF"/>
+            </w:tcBorders>
+          </w:tcPr>
+          <w:p>
+            <w:pPr>
+              <w:spacing w:after="0"/>
+            </w:pPr>
+            <w:r/>
+            <w:r>
+              <w:rPr>
+                <w:rFonts w:ascii="Arial" w:hAnsi="Arial" w:eastAsia="Microsoft JhengHei"/>
+                <w:b w:val="0"/>
+                <w:color w:val="172033"/>
+                <w:sz w:val="17"/>
+              </w:rPr>
+              <w:t>入口：同步頁、夜間作業、自然語言。</w:t>
+            </w:r>
+          </w:p>
+          <w:p>
+            <w:pPr>
+              <w:spacing w:after="0"/>
+            </w:pPr>
+            <w:r>
+              <w:rPr>
+                <w:rFonts w:ascii="Arial" w:hAnsi="Arial" w:eastAsia="Microsoft JhengHei"/>
+                <w:b w:val="0"/>
+                <w:color w:val="172033"/>
+                <w:sz w:val="17"/>
+              </w:rPr>
+              <w:t>檢查 Drive/NAS 同步。</w:t>
             </w:r>
           </w:p>
         </w:tc>
@@ -3051,13 +3389,13 @@
                 <w:color w:val="172033"/>
                 <w:sz w:val="17"/>
               </w:rPr>
-              <w:t>通知設定與 webhook</w:t>
+              <w:t>最近有 LIVE 或 runtime 健康證據，可列為可用功能。</w:t>
             </w:r>
           </w:p>
         </w:tc>
         <w:tc>
           <w:tcPr>
-            <w:tcW w:type="dxa" w:w="2381"/>
+            <w:tcW w:type="dxa" w:w="1134"/>
             <w:vAlign w:val="center"/>
             <w:shd w:fill="F8FAFC"/>
             <w:tcBorders>
@@ -3081,37 +3419,7 @@
                 <w:color w:val="172033"/>
                 <w:sz w:val="17"/>
               </w:rPr>
-              <w:t>CI + notification regression tests</w:t>
-            </w:r>
-          </w:p>
-        </w:tc>
-        <w:tc>
-          <w:tcPr>
-            <w:tcW w:type="dxa" w:w="680"/>
-            <w:vAlign w:val="center"/>
-            <w:shd w:fill="F8FAFC"/>
-            <w:tcBorders>
-              <w:top w:val="single" w:sz="6" w:space="0" w:color="D8E2EF"/>
-              <w:left w:val="single" w:sz="6" w:space="0" w:color="D8E2EF"/>
-              <w:bottom w:val="single" w:sz="6" w:space="0" w:color="D8E2EF"/>
-              <w:right w:val="single" w:sz="6" w:space="0" w:color="D8E2EF"/>
-              <w:insideH w:val="single" w:sz="6" w:space="0" w:color="D8E2EF"/>
-              <w:insideV w:val="single" w:sz="6" w:space="0" w:color="D8E2EF"/>
-            </w:tcBorders>
-          </w:tcPr>
-          <w:p>
-            <w:pPr>
-              <w:spacing w:after="0"/>
-            </w:pPr>
-            <w:r/>
-            <w:r>
-              <w:rPr>
-                <w:rFonts w:ascii="Arial" w:hAnsi="Arial" w:eastAsia="Microsoft JhengHei"/>
-                <w:b/>
-                <w:color w:val="15803D"/>
-                <w:sz w:val="17"/>
-              </w:rPr>
-              <w:t>PASS</w:t>
+              <w:t>帳務、Drive 與 NAS</w:t>
             </w:r>
           </w:p>
         </w:tc>
@@ -3143,13 +3451,13 @@
                 <w:color w:val="172033"/>
                 <w:sz w:val="17"/>
               </w:rPr>
-              <w:t>Google Drive / NAS 同步</w:t>
+              <w:t>帳務匯入</w:t>
             </w:r>
           </w:p>
         </w:tc>
         <w:tc>
           <w:tcPr>
-            <w:tcW w:type="dxa" w:w="2948"/>
+            <w:tcW w:type="dxa" w:w="2835"/>
             <w:vAlign w:val="center"/>
             <w:shd w:fill="FFFFFF"/>
             <w:tcBorders>
@@ -3173,7 +3481,51 @@
                 <w:color w:val="172033"/>
                 <w:sz w:val="17"/>
               </w:rPr>
-              <w:t>確認掛載、同步狀態、Drive token refresh、案件檔案與下載同步。</w:t>
+              <w:t>從 Google Sheets/Drive 匯入帳務，排除非本人項目並監控 OAuth 授權狀態。</w:t>
+            </w:r>
+          </w:p>
+        </w:tc>
+        <w:tc>
+          <w:tcPr>
+            <w:tcW w:type="dxa" w:w="2154"/>
+            <w:vAlign w:val="center"/>
+            <w:shd w:fill="FFFFFF"/>
+            <w:tcBorders>
+              <w:top w:val="single" w:sz="6" w:space="0" w:color="D8E2EF"/>
+              <w:left w:val="single" w:sz="6" w:space="0" w:color="D8E2EF"/>
+              <w:bottom w:val="single" w:sz="6" w:space="0" w:color="D8E2EF"/>
+              <w:right w:val="single" w:sz="6" w:space="0" w:color="D8E2EF"/>
+              <w:insideH w:val="single" w:sz="6" w:space="0" w:color="D8E2EF"/>
+              <w:insideV w:val="single" w:sz="6" w:space="0" w:color="D8E2EF"/>
+            </w:tcBorders>
+          </w:tcPr>
+          <w:p>
+            <w:pPr>
+              <w:spacing w:after="0"/>
+            </w:pPr>
+            <w:r/>
+            <w:r>
+              <w:rPr>
+                <w:rFonts w:ascii="Arial" w:hAnsi="Arial" w:eastAsia="Microsoft JhengHei"/>
+                <w:b w:val="0"/>
+                <w:color w:val="172033"/>
+                <w:sz w:val="17"/>
+              </w:rPr>
+              <w:t>入口：帳務頁、自然語言、Google Sheets。</w:t>
+            </w:r>
+          </w:p>
+          <w:p>
+            <w:pPr>
+              <w:spacing w:after="0"/>
+            </w:pPr>
+            <w:r>
+              <w:rPr>
+                <w:rFonts w:ascii="Arial" w:hAnsi="Arial" w:eastAsia="Microsoft JhengHei"/>
+                <w:b w:val="0"/>
+                <w:color w:val="172033"/>
+                <w:sz w:val="17"/>
+              </w:rPr>
+              <w:t>匯入這個月帳務，排除非本人項目。</w:t>
             </w:r>
           </w:p>
         </w:tc>
@@ -3203,13 +3555,13 @@
                 <w:color w:val="172033"/>
                 <w:sz w:val="17"/>
               </w:rPr>
-              <w:t>同步頁、夜間作業</w:t>
+              <w:t>最近有 LIVE 或 runtime 健康證據，可列為可用功能。</w:t>
             </w:r>
           </w:p>
         </w:tc>
         <w:tc>
           <w:tcPr>
-            <w:tcW w:type="dxa" w:w="2381"/>
+            <w:tcW w:type="dxa" w:w="1134"/>
             <w:vAlign w:val="center"/>
             <w:shd w:fill="FFFFFF"/>
             <w:tcBorders>
@@ -3233,37 +3585,7 @@
                 <w:color w:val="172033"/>
                 <w:sz w:val="17"/>
               </w:rPr>
-              <w:t>nas_mounts_live + drive_sync_status_live</w:t>
-            </w:r>
-          </w:p>
-        </w:tc>
-        <w:tc>
-          <w:tcPr>
-            <w:tcW w:type="dxa" w:w="680"/>
-            <w:vAlign w:val="center"/>
-            <w:shd w:fill="FFFFFF"/>
-            <w:tcBorders>
-              <w:top w:val="single" w:sz="6" w:space="0" w:color="D8E2EF"/>
-              <w:left w:val="single" w:sz="6" w:space="0" w:color="D8E2EF"/>
-              <w:bottom w:val="single" w:sz="6" w:space="0" w:color="D8E2EF"/>
-              <w:right w:val="single" w:sz="6" w:space="0" w:color="D8E2EF"/>
-              <w:insideH w:val="single" w:sz="6" w:space="0" w:color="D8E2EF"/>
-              <w:insideV w:val="single" w:sz="6" w:space="0" w:color="D8E2EF"/>
-            </w:tcBorders>
-          </w:tcPr>
-          <w:p>
-            <w:pPr>
-              <w:spacing w:after="0"/>
-            </w:pPr>
-            <w:r/>
-            <w:r>
-              <w:rPr>
-                <w:rFonts w:ascii="Arial" w:hAnsi="Arial" w:eastAsia="Microsoft JhengHei"/>
-                <w:b/>
-                <w:color w:val="15803D"/>
-                <w:sz w:val="17"/>
-              </w:rPr>
-              <w:t>PASS</w:t>
+              <w:t>帳務、Drive 與 NAS</w:t>
             </w:r>
           </w:p>
         </w:tc>
@@ -3295,13 +3617,13 @@
                 <w:color w:val="172033"/>
                 <w:sz w:val="17"/>
               </w:rPr>
-              <w:t>帳務匯入</w:t>
+              <w:t>模型與資源治理</w:t>
             </w:r>
           </w:p>
         </w:tc>
         <w:tc>
           <w:tcPr>
-            <w:tcW w:type="dxa" w:w="2948"/>
+            <w:tcW w:type="dxa" w:w="2835"/>
             <w:vAlign w:val="center"/>
             <w:shd w:fill="F8FAFC"/>
             <w:tcBorders>
@@ -3325,7 +3647,65 @@
                 <w:color w:val="172033"/>
                 <w:sz w:val="17"/>
               </w:rPr>
-              <w:t>從 Google Sheets/Drive 匯入帳務，排除非本人項目並監控 OAuth token。</w:t>
+              <w:t>確認日夜模型、MTP sidecar、resource governor 與重型模式在目前資源下可安全運作。</w:t>
+            </w:r>
+          </w:p>
+        </w:tc>
+        <w:tc>
+          <w:tcPr>
+            <w:tcW w:type="dxa" w:w="2154"/>
+            <w:vAlign w:val="center"/>
+            <w:shd w:fill="F8FAFC"/>
+            <w:tcBorders>
+              <w:top w:val="single" w:sz="6" w:space="0" w:color="D8E2EF"/>
+              <w:left w:val="single" w:sz="6" w:space="0" w:color="D8E2EF"/>
+              <w:bottom w:val="single" w:sz="6" w:space="0" w:color="D8E2EF"/>
+              <w:right w:val="single" w:sz="6" w:space="0" w:color="D8E2EF"/>
+              <w:insideH w:val="single" w:sz="6" w:space="0" w:color="D8E2EF"/>
+              <w:insideV w:val="single" w:sz="6" w:space="0" w:color="D8E2EF"/>
+            </w:tcBorders>
+          </w:tcPr>
+          <w:p>
+            <w:pPr>
+              <w:spacing w:after="0"/>
+            </w:pPr>
+            <w:r/>
+            <w:r>
+              <w:rPr>
+                <w:rFonts w:ascii="Arial" w:hAnsi="Arial" w:eastAsia="Microsoft JhengHei"/>
+                <w:b w:val="0"/>
+                <w:color w:val="172033"/>
+                <w:sz w:val="17"/>
+              </w:rPr>
+              <w:t>入口：系統狀態、夜間巡檢、@heavy。</w:t>
+            </w:r>
+          </w:p>
+          <w:p>
+            <w:pPr>
+              <w:spacing w:after="0"/>
+            </w:pPr>
+            <w:r>
+              <w:rPr>
+                <w:rFonts w:ascii="Arial" w:hAnsi="Arial" w:eastAsia="Microsoft JhengHei"/>
+                <w:b w:val="0"/>
+                <w:color w:val="172033"/>
+                <w:sz w:val="17"/>
+              </w:rPr>
+              <w:t>檢查目前模型。</w:t>
+            </w:r>
+          </w:p>
+          <w:p>
+            <w:pPr>
+              <w:spacing w:after="0"/>
+            </w:pPr>
+            <w:r>
+              <w:rPr>
+                <w:rFonts w:ascii="Arial" w:hAnsi="Arial" w:eastAsia="Microsoft JhengHei"/>
+                <w:b w:val="0"/>
+                <w:color w:val="172033"/>
+                <w:sz w:val="17"/>
+              </w:rPr>
+              <w:t>@heavy 請精讀這份長文件。</w:t>
             </w:r>
           </w:p>
         </w:tc>
@@ -3355,13 +3735,13 @@
                 <w:color w:val="172033"/>
                 <w:sz w:val="17"/>
               </w:rPr>
-              <w:t>帳務頁或自然語言</w:t>
+              <w:t>最近有 LIVE 或 runtime 健康證據，可列為可用功能。</w:t>
             </w:r>
           </w:p>
         </w:tc>
         <w:tc>
           <w:tcPr>
-            <w:tcW w:type="dxa" w:w="2381"/>
+            <w:tcW w:type="dxa" w:w="1134"/>
             <w:vAlign w:val="center"/>
             <w:shd w:fill="F8FAFC"/>
             <w:tcBorders>
@@ -3385,37 +3765,7 @@
                 <w:color w:val="172033"/>
                 <w:sz w:val="17"/>
               </w:rPr>
-              <w:t>manual smoke accounting_query + token_health_refresh</w:t>
-            </w:r>
-          </w:p>
-        </w:tc>
-        <w:tc>
-          <w:tcPr>
-            <w:tcW w:type="dxa" w:w="680"/>
-            <w:vAlign w:val="center"/>
-            <w:shd w:fill="F8FAFC"/>
-            <w:tcBorders>
-              <w:top w:val="single" w:sz="6" w:space="0" w:color="D8E2EF"/>
-              <w:left w:val="single" w:sz="6" w:space="0" w:color="D8E2EF"/>
-              <w:bottom w:val="single" w:sz="6" w:space="0" w:color="D8E2EF"/>
-              <w:right w:val="single" w:sz="6" w:space="0" w:color="D8E2EF"/>
-              <w:insideH w:val="single" w:sz="6" w:space="0" w:color="D8E2EF"/>
-              <w:insideV w:val="single" w:sz="6" w:space="0" w:color="D8E2EF"/>
-            </w:tcBorders>
-          </w:tcPr>
-          <w:p>
-            <w:pPr>
-              <w:spacing w:after="0"/>
-            </w:pPr>
-            <w:r/>
-            <w:r>
-              <w:rPr>
-                <w:rFonts w:ascii="Arial" w:hAnsi="Arial" w:eastAsia="Microsoft JhengHei"/>
-                <w:b/>
-                <w:color w:val="15803D"/>
-                <w:sz w:val="17"/>
-              </w:rPr>
-              <w:t>PASS</w:t>
+              <w:t>每日啟動與健康檢查</w:t>
             </w:r>
           </w:p>
         </w:tc>
@@ -3447,13 +3797,13 @@
                 <w:color w:val="172033"/>
                 <w:sz w:val="17"/>
               </w:rPr>
-              <w:t>模型與資源治理</w:t>
+              <w:t>安全與公開版守門</w:t>
             </w:r>
           </w:p>
         </w:tc>
         <w:tc>
           <w:tcPr>
-            <w:tcW w:type="dxa" w:w="2948"/>
+            <w:tcW w:type="dxa" w:w="2835"/>
             <w:vAlign w:val="center"/>
             <w:shd w:fill="FFFFFF"/>
             <w:tcBorders>
@@ -3477,7 +3827,65 @@
                 <w:color w:val="172033"/>
                 <w:sz w:val="17"/>
               </w:rPr>
-              <w:t>日夜模型 gate、resource governor、MTP sidecar 健康檢查。</w:t>
+              <w:t>發布或交付前檢查私密資料、硬編碼端點、不安全 shell、公開版隔離與 release gate。</w:t>
+            </w:r>
+          </w:p>
+        </w:tc>
+        <w:tc>
+          <w:tcPr>
+            <w:tcW w:type="dxa" w:w="2154"/>
+            <w:vAlign w:val="center"/>
+            <w:shd w:fill="FFFFFF"/>
+            <w:tcBorders>
+              <w:top w:val="single" w:sz="6" w:space="0" w:color="D8E2EF"/>
+              <w:left w:val="single" w:sz="6" w:space="0" w:color="D8E2EF"/>
+              <w:bottom w:val="single" w:sz="6" w:space="0" w:color="D8E2EF"/>
+              <w:right w:val="single" w:sz="6" w:space="0" w:color="D8E2EF"/>
+              <w:insideH w:val="single" w:sz="6" w:space="0" w:color="D8E2EF"/>
+              <w:insideV w:val="single" w:sz="6" w:space="0" w:color="D8E2EF"/>
+            </w:tcBorders>
+          </w:tcPr>
+          <w:p>
+            <w:pPr>
+              <w:spacing w:after="0"/>
+            </w:pPr>
+            <w:r/>
+            <w:r>
+              <w:rPr>
+                <w:rFonts w:ascii="Arial" w:hAnsi="Arial" w:eastAsia="Microsoft JhengHei"/>
+                <w:b w:val="0"/>
+                <w:color w:val="172033"/>
+                <w:sz w:val="17"/>
+              </w:rPr>
+              <w:t>入口：CI、release guard、public audit。</w:t>
+            </w:r>
+          </w:p>
+          <w:p>
+            <w:pPr>
+              <w:spacing w:after="0"/>
+            </w:pPr>
+            <w:r>
+              <w:rPr>
+                <w:rFonts w:ascii="Arial" w:hAnsi="Arial" w:eastAsia="Microsoft JhengHei"/>
+                <w:b w:val="0"/>
+                <w:color w:val="172033"/>
+                <w:sz w:val="17"/>
+              </w:rPr>
+              <w:t>跑公開版隔離檢查。</w:t>
+            </w:r>
+          </w:p>
+          <w:p>
+            <w:pPr>
+              <w:spacing w:after="0"/>
+            </w:pPr>
+            <w:r>
+              <w:rPr>
+                <w:rFonts w:ascii="Arial" w:hAnsi="Arial" w:eastAsia="Microsoft JhengHei"/>
+                <w:b w:val="0"/>
+                <w:color w:val="172033"/>
+                <w:sz w:val="17"/>
+              </w:rPr>
+              <w:t>跑 commercial-release gate。</w:t>
             </w:r>
           </w:p>
         </w:tc>
@@ -3507,13 +3915,13 @@
                 <w:color w:val="172033"/>
                 <w:sz w:val="17"/>
               </w:rPr>
-              <w:t>系統狀態、夜間巡檢</w:t>
+              <w:t>最近有 LIVE 或 runtime 健康證據，可列為可用功能。</w:t>
             </w:r>
           </w:p>
         </w:tc>
         <w:tc>
           <w:tcPr>
-            <w:tcW w:type="dxa" w:w="2381"/>
+            <w:tcW w:type="dxa" w:w="1134"/>
             <w:vAlign w:val="center"/>
             <w:shd w:fill="FFFFFF"/>
             <w:tcBorders>
@@ -3537,189 +3945,7 @@
                 <w:color w:val="172033"/>
                 <w:sz w:val="17"/>
               </w:rPr>
-              <w:t>doctor + resource_governor + model_live_gate</w:t>
-            </w:r>
-          </w:p>
-        </w:tc>
-        <w:tc>
-          <w:tcPr>
-            <w:tcW w:type="dxa" w:w="680"/>
-            <w:vAlign w:val="center"/>
-            <w:shd w:fill="FFFFFF"/>
-            <w:tcBorders>
-              <w:top w:val="single" w:sz="6" w:space="0" w:color="D8E2EF"/>
-              <w:left w:val="single" w:sz="6" w:space="0" w:color="D8E2EF"/>
-              <w:bottom w:val="single" w:sz="6" w:space="0" w:color="D8E2EF"/>
-              <w:right w:val="single" w:sz="6" w:space="0" w:color="D8E2EF"/>
-              <w:insideH w:val="single" w:sz="6" w:space="0" w:color="D8E2EF"/>
-              <w:insideV w:val="single" w:sz="6" w:space="0" w:color="D8E2EF"/>
-            </w:tcBorders>
-          </w:tcPr>
-          <w:p>
-            <w:pPr>
-              <w:spacing w:after="0"/>
-            </w:pPr>
-            <w:r/>
-            <w:r>
-              <w:rPr>
-                <w:rFonts w:ascii="Arial" w:hAnsi="Arial" w:eastAsia="Microsoft JhengHei"/>
-                <w:b/>
-                <w:color w:val="15803D"/>
-                <w:sz w:val="17"/>
-              </w:rPr>
-              <w:t>PASS</w:t>
-            </w:r>
-          </w:p>
-        </w:tc>
-      </w:tr>
-      <w:tr>
-        <w:tc>
-          <w:tcPr>
-            <w:tcW w:type="dxa" w:w="1814"/>
-            <w:vAlign w:val="center"/>
-            <w:shd w:fill="F8FAFC"/>
-            <w:tcBorders>
-              <w:top w:val="single" w:sz="6" w:space="0" w:color="D8E2EF"/>
-              <w:left w:val="single" w:sz="6" w:space="0" w:color="D8E2EF"/>
-              <w:bottom w:val="single" w:sz="6" w:space="0" w:color="D8E2EF"/>
-              <w:right w:val="single" w:sz="6" w:space="0" w:color="D8E2EF"/>
-              <w:insideH w:val="single" w:sz="6" w:space="0" w:color="D8E2EF"/>
-              <w:insideV w:val="single" w:sz="6" w:space="0" w:color="D8E2EF"/>
-            </w:tcBorders>
-          </w:tcPr>
-          <w:p>
-            <w:pPr>
-              <w:spacing w:after="0"/>
-            </w:pPr>
-            <w:r/>
-            <w:r>
-              <w:rPr>
-                <w:rFonts w:ascii="Arial" w:hAnsi="Arial" w:eastAsia="Microsoft JhengHei"/>
-                <w:b w:val="0"/>
-                <w:color w:val="172033"/>
-                <w:sz w:val="17"/>
-              </w:rPr>
-              <w:t>安全與公開版守門</w:t>
-            </w:r>
-          </w:p>
-        </w:tc>
-        <w:tc>
-          <w:tcPr>
-            <w:tcW w:type="dxa" w:w="2948"/>
-            <w:vAlign w:val="center"/>
-            <w:shd w:fill="F8FAFC"/>
-            <w:tcBorders>
-              <w:top w:val="single" w:sz="6" w:space="0" w:color="D8E2EF"/>
-              <w:left w:val="single" w:sz="6" w:space="0" w:color="D8E2EF"/>
-              <w:bottom w:val="single" w:sz="6" w:space="0" w:color="D8E2EF"/>
-              <w:right w:val="single" w:sz="6" w:space="0" w:color="D8E2EF"/>
-              <w:insideH w:val="single" w:sz="6" w:space="0" w:color="D8E2EF"/>
-              <w:insideV w:val="single" w:sz="6" w:space="0" w:color="D8E2EF"/>
-            </w:tcBorders>
-          </w:tcPr>
-          <w:p>
-            <w:pPr>
-              <w:spacing w:after="0"/>
-            </w:pPr>
-            <w:r/>
-            <w:r>
-              <w:rPr>
-                <w:rFonts w:ascii="Arial" w:hAnsi="Arial" w:eastAsia="Microsoft JhengHei"/>
-                <w:b w:val="0"/>
-                <w:color w:val="172033"/>
-                <w:sz w:val="17"/>
-              </w:rPr>
-              <w:t>避免硬編碼端點、禁止不安全 shell、公開版發布前清查私密資料。</w:t>
-            </w:r>
-          </w:p>
-        </w:tc>
-        <w:tc>
-          <w:tcPr>
-            <w:tcW w:type="dxa" w:w="1984"/>
-            <w:vAlign w:val="center"/>
-            <w:shd w:fill="F8FAFC"/>
-            <w:tcBorders>
-              <w:top w:val="single" w:sz="6" w:space="0" w:color="D8E2EF"/>
-              <w:left w:val="single" w:sz="6" w:space="0" w:color="D8E2EF"/>
-              <w:bottom w:val="single" w:sz="6" w:space="0" w:color="D8E2EF"/>
-              <w:right w:val="single" w:sz="6" w:space="0" w:color="D8E2EF"/>
-              <w:insideH w:val="single" w:sz="6" w:space="0" w:color="D8E2EF"/>
-              <w:insideV w:val="single" w:sz="6" w:space="0" w:color="D8E2EF"/>
-            </w:tcBorders>
-          </w:tcPr>
-          <w:p>
-            <w:pPr>
-              <w:spacing w:after="0"/>
-            </w:pPr>
-            <w:r/>
-            <w:r>
-              <w:rPr>
-                <w:rFonts w:ascii="Arial" w:hAnsi="Arial" w:eastAsia="Microsoft JhengHei"/>
-                <w:b w:val="0"/>
-                <w:color w:val="172033"/>
-                <w:sz w:val="17"/>
-              </w:rPr>
-              <w:t>CI / release guard</w:t>
-            </w:r>
-          </w:p>
-        </w:tc>
-        <w:tc>
-          <w:tcPr>
-            <w:tcW w:type="dxa" w:w="2381"/>
-            <w:vAlign w:val="center"/>
-            <w:shd w:fill="F8FAFC"/>
-            <w:tcBorders>
-              <w:top w:val="single" w:sz="6" w:space="0" w:color="D8E2EF"/>
-              <w:left w:val="single" w:sz="6" w:space="0" w:color="D8E2EF"/>
-              <w:bottom w:val="single" w:sz="6" w:space="0" w:color="D8E2EF"/>
-              <w:right w:val="single" w:sz="6" w:space="0" w:color="D8E2EF"/>
-              <w:insideH w:val="single" w:sz="6" w:space="0" w:color="D8E2EF"/>
-              <w:insideV w:val="single" w:sz="6" w:space="0" w:color="D8E2EF"/>
-            </w:tcBorders>
-          </w:tcPr>
-          <w:p>
-            <w:pPr>
-              <w:spacing w:after="0"/>
-            </w:pPr>
-            <w:r/>
-            <w:r>
-              <w:rPr>
-                <w:rFonts w:ascii="Arial" w:hAnsi="Arial" w:eastAsia="Microsoft JhengHei"/>
-                <w:b w:val="0"/>
-                <w:color w:val="172033"/>
-                <w:sz w:val="17"/>
-              </w:rPr>
-              <w:t>hardcoded_runtime_guard + shell_true_guard + public audit</w:t>
-            </w:r>
-          </w:p>
-        </w:tc>
-        <w:tc>
-          <w:tcPr>
-            <w:tcW w:type="dxa" w:w="680"/>
-            <w:vAlign w:val="center"/>
-            <w:shd w:fill="F8FAFC"/>
-            <w:tcBorders>
-              <w:top w:val="single" w:sz="6" w:space="0" w:color="D8E2EF"/>
-              <w:left w:val="single" w:sz="6" w:space="0" w:color="D8E2EF"/>
-              <w:bottom w:val="single" w:sz="6" w:space="0" w:color="D8E2EF"/>
-              <w:right w:val="single" w:sz="6" w:space="0" w:color="D8E2EF"/>
-              <w:insideH w:val="single" w:sz="6" w:space="0" w:color="D8E2EF"/>
-              <w:insideV w:val="single" w:sz="6" w:space="0" w:color="D8E2EF"/>
-            </w:tcBorders>
-          </w:tcPr>
-          <w:p>
-            <w:pPr>
-              <w:spacing w:after="0"/>
-            </w:pPr>
-            <w:r/>
-            <w:r>
-              <w:rPr>
-                <w:rFonts w:ascii="Arial" w:hAnsi="Arial" w:eastAsia="Microsoft JhengHei"/>
-                <w:b/>
-                <w:color w:val="15803D"/>
-                <w:sz w:val="17"/>
-              </w:rPr>
-              <w:t>PASS</w:t>
+              <w:t>使用守則</w:t>
             </w:r>
           </w:p>
         </w:tc>

</xml_diff>